<commit_message>
Updated SLA Monnth Report Fix
</commit_message>
<xml_diff>
--- a/data/samples/output/Enugu_Week3_generated.docx
+++ b/data/samples/output/Enugu_Week3_generated.docx
@@ -23,7 +23,7 @@
     </w:p>
     <w:p>
       <w:r>
-        <w:t>This report covers the Enugu region for Week 3 (2026-09-13 to 2026-09-19), and is limited to 33kV feeders where the outage is attributed to TCN equipment. Over this period there were 92 outages totaling 360.67 hours and 2,005.08 MWh of load loss, with 8 feeders exceeding their SLA allocation at an estimated cost of NGN 217,430,514. The previous issued period (Week 2) recorded an estimated cost of NGN 0, so the cost this week represents a sharp rise; note that the Week 2 outages figure supplied (335,110,953.33) is inconsistent with an hours count and should be checked before comparison.</w:t>
+        <w:t>This report covers Enugu region for Week 3 (13 to 19 September 2026) and is limited to 33kV feeders where the outage is attributed to TCN equipment. During the period, TCN-attributed outages across the region totaled 93 events and 366.65 hours, with an estimated load loss of 2,038.59 MWh. Note that the previous issued period (Week 2) figures on file are inconsistent (outages field shows 335,110,953.33 and cost shows 0), so a reliable week-on-week comparison cannot be made here; readers should rely on the month-to-date figures rather than comparing single weeks.</w:t>
       </w:r>
     </w:p>
     <w:p>
@@ -65,7 +65,7 @@
                 <w:b/>
                 <w:sz w:val="28"/>
               </w:rPr>
-              <w:t>92</w:t>
+              <w:t>93</w:t>
             </w:r>
           </w:p>
         </w:tc>
@@ -88,7 +88,7 @@
                 <w:b/>
                 <w:sz w:val="28"/>
               </w:rPr>
-              <w:t>360.67</w:t>
+              <w:t>366.65</w:t>
             </w:r>
           </w:p>
         </w:tc>
@@ -111,7 +111,7 @@
                 <w:b/>
                 <w:sz w:val="28"/>
               </w:rPr>
-              <w:t>2,005.08 MWh</w:t>
+              <w:t>2,038.59 MWh</w:t>
             </w:r>
           </w:p>
         </w:tc>
@@ -185,7 +185,7 @@
           </w:tcPr>
           <w:p>
             <w:r>
-              <w:t>54.3%</w:t>
+              <w:t>53.8%</w:t>
             </w:r>
           </w:p>
         </w:tc>
@@ -207,7 +207,7 @@
           </w:tcPr>
           <w:p>
             <w:r>
-              <w:t>41.3%</w:t>
+              <w:t>41.9%</w:t>
             </w:r>
           </w:p>
         </w:tc>
@@ -238,7 +238,7 @@
     <w:p/>
     <w:p>
       <w:r>
-        <w:t>All outages in this report are attributed to TCN-owned equipment, chiefly the transformers at Onitsha 132kV station (3NSHTR5 Mob-1 45MVA and 3NSHTR3 TR13 60MVA), and TCN maintenance crews are recorded as the parties opening and closing these feeders.</w:t>
+        <w:t>All outages listed in this report are attributed to TCN-owned equipment, principally the 3NSHTR5 (Mob-1) 45MVA and 3NSHTR3 (TR13) 60MVA 132/33kV transformers at Onitsha 132kV station, and the responsibility for the resulting SLA exceedances rests with TCN transformer maintenance and protection teams at that station.</w:t>
       </w:r>
     </w:p>
     <w:p>
@@ -372,7 +372,7 @@
           </w:tcPr>
           <w:p>
             <w:r>
-              <w:t>47</w:t>
+              <w:t>48</w:t>
             </w:r>
           </w:p>
         </w:tc>
@@ -382,7 +382,7 @@
           </w:tcPr>
           <w:p>
             <w:r>
-              <w:t>19,957.00</w:t>
+              <w:t>20,316.00</w:t>
             </w:r>
           </w:p>
         </w:tc>
@@ -392,7 +392,7 @@
           </w:tcPr>
           <w:p>
             <w:r>
-              <w:t>424.62</w:t>
+              <w:t>423.25</w:t>
             </w:r>
           </w:p>
         </w:tc>
@@ -402,7 +402,7 @@
           </w:tcPr>
           <w:p>
             <w:r>
-              <w:t>1,851.24</w:t>
+              <w:t>1,884.75</w:t>
             </w:r>
           </w:p>
         </w:tc>
@@ -412,7 +412,7 @@
           </w:tcPr>
           <w:p>
             <w:r>
-              <w:t>39.39</w:t>
+              <w:t>39.27</w:t>
             </w:r>
           </w:p>
         </w:tc>
@@ -1114,7 +1114,7 @@
           </w:tcPr>
           <w:p>
             <w:r>
-              <w:t>6</w:t>
+              <w:t>7</w:t>
             </w:r>
           </w:p>
         </w:tc>
@@ -1124,7 +1124,7 @@
           </w:tcPr>
           <w:p>
             <w:r>
-              <w:t>36.88</w:t>
+              <w:t>42.87</w:t>
             </w:r>
           </w:p>
         </w:tc>
@@ -1134,7 +1134,7 @@
           </w:tcPr>
           <w:p>
             <w:r>
-              <w:t>6.15</w:t>
+              <w:t>6.12</w:t>
             </w:r>
           </w:p>
         </w:tc>
@@ -1144,7 +1144,7 @@
           </w:tcPr>
           <w:p>
             <w:r>
-              <w:t>176.78</w:t>
+              <w:t>210.29</w:t>
             </w:r>
           </w:p>
         </w:tc>
@@ -1941,7 +1941,7 @@
     </w:p>
     <w:p>
       <w:r>
-        <w:t>Each feeder is allowed a set number of outage hours per month according to its band; feeders with no recorded band default to 4 hours per day of allowable downtime. The SLA Compliance table below compares each feeder's TCN hours against this allowance to determine the excess hours driving the exceedance cost.</w:t>
+        <w:t>Each feeder is allowed a fixed number of outage hours per day depending on its assigned band (A or B); feeders with no recorded band are defaulted to 4 hours per day for the purpose of this calculation. The SLA Compliance table below compares each feeder's actual TCN hours against this allowable figure to determine whether it is within or over its allocation for the period.</w:t>
       </w:r>
     </w:p>
     <w:tbl>
@@ -2077,7 +2077,7 @@
           </w:tcPr>
           <w:p>
             <w:r>
-              <w:t>A (assumed)</w:t>
+              <w:t>A</w:t>
             </w:r>
           </w:p>
         </w:tc>
@@ -2315,7 +2315,7 @@
           </w:tcPr>
           <w:p>
             <w:r>
-              <w:t>OBOSI</w:t>
+              <w:t>UMUNYA</w:t>
             </w:r>
           </w:p>
         </w:tc>
@@ -2325,7 +2325,7 @@
           </w:tcPr>
           <w:p>
             <w:r>
-              <w:t>A (assumed)</w:t>
+              <w:t>B</w:t>
             </w:r>
           </w:p>
         </w:tc>
@@ -2335,7 +2335,7 @@
           </w:tcPr>
           <w:p>
             <w:r>
-              <w:t>33.70</w:t>
+              <w:t>42.87</w:t>
             </w:r>
           </w:p>
         </w:tc>
@@ -2345,7 +2345,7 @@
           </w:tcPr>
           <w:p>
             <w:r>
-              <w:t>8.40</w:t>
+              <w:t>16.80</w:t>
             </w:r>
           </w:p>
         </w:tc>
@@ -2355,7 +2355,7 @@
           </w:tcPr>
           <w:p>
             <w:r>
-              <w:t>-25.30</w:t>
+              <w:t>-26.07</w:t>
             </w:r>
           </w:p>
         </w:tc>
@@ -2377,7 +2377,7 @@
           </w:tcPr>
           <w:p>
             <w:r>
-              <w:t>UMUNYA</w:t>
+              <w:t>OBOSI</w:t>
             </w:r>
           </w:p>
         </w:tc>
@@ -2397,7 +2397,7 @@
           </w:tcPr>
           <w:p>
             <w:r>
-              <w:t>36.88</w:t>
+              <w:t>33.70</w:t>
             </w:r>
           </w:p>
         </w:tc>
@@ -2417,7 +2417,7 @@
           </w:tcPr>
           <w:p>
             <w:r>
-              <w:t>-20.08</w:t>
+              <w:t>-16.90</w:t>
             </w:r>
           </w:p>
         </w:tc>
@@ -2573,7 +2573,7 @@
           </w:tcPr>
           <w:p>
             <w:r>
-              <w:t>A (assumed)</w:t>
+              <w:t>A</w:t>
             </w:r>
           </w:p>
         </w:tc>
@@ -2635,7 +2635,7 @@
           </w:tcPr>
           <w:p>
             <w:r>
-              <w:t>A (assumed)</w:t>
+              <w:t>A</w:t>
             </w:r>
           </w:p>
         </w:tc>
@@ -2883,7 +2883,7 @@
           </w:tcPr>
           <w:p>
             <w:r>
-              <w:t>A (assumed)</w:t>
+              <w:t>A</w:t>
             </w:r>
           </w:p>
         </w:tc>
@@ -2945,7 +2945,7 @@
           </w:tcPr>
           <w:p>
             <w:r>
-              <w:t>A (assumed)</w:t>
+              <w:t>A</w:t>
             </w:r>
           </w:p>
         </w:tc>
@@ -3069,7 +3069,7 @@
           </w:tcPr>
           <w:p>
             <w:r>
-              <w:t>A (assumed)</w:t>
+              <w:t>A</w:t>
             </w:r>
           </w:p>
         </w:tc>
@@ -3255,7 +3255,7 @@
           </w:tcPr>
           <w:p>
             <w:r>
-              <w:t>A (assumed)</w:t>
+              <w:t>A</w:t>
             </w:r>
           </w:p>
         </w:tc>
@@ -3317,7 +3317,7 @@
           </w:tcPr>
           <w:p>
             <w:r>
-              <w:t>A (assumed)</w:t>
+              <w:t>A</w:t>
             </w:r>
           </w:p>
         </w:tc>
@@ -3369,7 +3369,7 @@
           </w:tcPr>
           <w:p>
             <w:r>
-              <w:t>ORUMBA</w:t>
+              <w:t>OJI LOCAL</w:t>
             </w:r>
           </w:p>
         </w:tc>
@@ -3379,7 +3379,7 @@
           </w:tcPr>
           <w:p>
             <w:r>
-              <w:t>A (assumed)</w:t>
+              <w:t>A</w:t>
             </w:r>
           </w:p>
         </w:tc>
@@ -3389,7 +3389,7 @@
           </w:tcPr>
           <w:p>
             <w:r>
-              <w:t>0.60</w:t>
+              <w:t>0.57</w:t>
             </w:r>
           </w:p>
         </w:tc>
@@ -3409,7 +3409,7 @@
           </w:tcPr>
           <w:p>
             <w:r>
-              <w:t>7.80</w:t>
+              <w:t>7.83</w:t>
             </w:r>
           </w:p>
         </w:tc>
@@ -3421,7 +3421,7 @@
           </w:tcPr>
           <w:p>
             <w:r>
-              <w:t>Oji River 132kV</w:t>
+              <w:t>Agu Awka 132kV</w:t>
             </w:r>
           </w:p>
         </w:tc>
@@ -3431,7 +3431,7 @@
           </w:tcPr>
           <w:p>
             <w:r>
-              <w:t>OJI LOCAL</w:t>
+              <w:t>ROTIC</w:t>
             </w:r>
           </w:p>
         </w:tc>
@@ -3451,7 +3451,7 @@
           </w:tcPr>
           <w:p>
             <w:r>
-              <w:t>0.57</w:t>
+              <w:t>0.55</w:t>
             </w:r>
           </w:p>
         </w:tc>
@@ -3471,7 +3471,7 @@
           </w:tcPr>
           <w:p>
             <w:r>
-              <w:t>7.83</w:t>
+              <w:t>7.85</w:t>
             </w:r>
           </w:p>
         </w:tc>
@@ -3483,7 +3483,7 @@
           </w:tcPr>
           <w:p>
             <w:r>
-              <w:t>Agu Awka 132kV</w:t>
+              <w:t>Oji River 132kV</w:t>
             </w:r>
           </w:p>
         </w:tc>
@@ -3493,7 +3493,7 @@
           </w:tcPr>
           <w:p>
             <w:r>
-              <w:t>ROTIC</w:t>
+              <w:t>COCA COLA</w:t>
             </w:r>
           </w:p>
         </w:tc>
@@ -3503,7 +3503,7 @@
           </w:tcPr>
           <w:p>
             <w:r>
-              <w:t>A (assumed)</w:t>
+              <w:t>A</w:t>
             </w:r>
           </w:p>
         </w:tc>
@@ -3513,7 +3513,7 @@
           </w:tcPr>
           <w:p>
             <w:r>
-              <w:t>0.55</w:t>
+              <w:t>0.53</w:t>
             </w:r>
           </w:p>
         </w:tc>
@@ -3533,7 +3533,7 @@
           </w:tcPr>
           <w:p>
             <w:r>
-              <w:t>7.85</w:t>
+              <w:t>7.87</w:t>
             </w:r>
           </w:p>
         </w:tc>
@@ -3545,7 +3545,7 @@
           </w:tcPr>
           <w:p>
             <w:r>
-              <w:t>Oji River 132kV</w:t>
+              <w:t>Agu Awka 132kV</w:t>
             </w:r>
           </w:p>
         </w:tc>
@@ -3555,7 +3555,7 @@
           </w:tcPr>
           <w:p>
             <w:r>
-              <w:t>COCA COLA</w:t>
+              <w:t>OGBOJI</w:t>
             </w:r>
           </w:p>
         </w:tc>
@@ -3575,7 +3575,7 @@
           </w:tcPr>
           <w:p>
             <w:r>
-              <w:t>0.53</w:t>
+              <w:t>0.52</w:t>
             </w:r>
           </w:p>
         </w:tc>
@@ -3595,7 +3595,7 @@
           </w:tcPr>
           <w:p>
             <w:r>
-              <w:t>7.87</w:t>
+              <w:t>7.88</w:t>
             </w:r>
           </w:p>
         </w:tc>
@@ -3607,7 +3607,7 @@
           </w:tcPr>
           <w:p>
             <w:r>
-              <w:t>Agu Awka 132kV</w:t>
+              <w:t>New-Haven 132kV</w:t>
             </w:r>
           </w:p>
         </w:tc>
@@ -3617,7 +3617,7 @@
           </w:tcPr>
           <w:p>
             <w:r>
-              <w:t>OGBOJI</w:t>
+              <w:t>NEW HAVEN</w:t>
             </w:r>
           </w:p>
         </w:tc>
@@ -3627,7 +3627,7 @@
           </w:tcPr>
           <w:p>
             <w:r>
-              <w:t>A (assumed)</w:t>
+              <w:t>A</w:t>
             </w:r>
           </w:p>
         </w:tc>
@@ -3637,7 +3637,7 @@
           </w:tcPr>
           <w:p>
             <w:r>
-              <w:t>0.52</w:t>
+              <w:t>0.50</w:t>
             </w:r>
           </w:p>
         </w:tc>
@@ -3657,7 +3657,7 @@
           </w:tcPr>
           <w:p>
             <w:r>
-              <w:t>7.88</w:t>
+              <w:t>7.90</w:t>
             </w:r>
           </w:p>
         </w:tc>
@@ -3689,7 +3689,7 @@
           </w:tcPr>
           <w:p>
             <w:r>
-              <w:t>A (assumed)</w:t>
+              <w:t>A</w:t>
             </w:r>
           </w:p>
         </w:tc>
@@ -3751,7 +3751,7 @@
           </w:tcPr>
           <w:p>
             <w:r>
-              <w:t>A (assumed)</w:t>
+              <w:t>A</w:t>
             </w:r>
           </w:p>
         </w:tc>
@@ -3803,7 +3803,7 @@
           </w:tcPr>
           <w:p>
             <w:r>
-              <w:t>NEW HAVEN</w:t>
+              <w:t>NEW NNPC</w:t>
             </w:r>
           </w:p>
         </w:tc>
@@ -3855,7 +3855,7 @@
           </w:tcPr>
           <w:p>
             <w:r>
-              <w:t>New-Haven 132kV</w:t>
+              <w:t>UNN Nsukka 132kV</w:t>
             </w:r>
           </w:p>
         </w:tc>
@@ -3865,7 +3865,7 @@
           </w:tcPr>
           <w:p>
             <w:r>
-              <w:t>NEW NNPC</w:t>
+              <w:t>SUMAS</w:t>
             </w:r>
           </w:p>
         </w:tc>
@@ -3927,7 +3927,7 @@
           </w:tcPr>
           <w:p>
             <w:r>
-              <w:t>SUMAS</w:t>
+              <w:t>UNN</w:t>
             </w:r>
           </w:p>
         </w:tc>
@@ -3947,7 +3947,7 @@
           </w:tcPr>
           <w:p>
             <w:r>
-              <w:t>0.50</w:t>
+              <w:t>0.47</w:t>
             </w:r>
           </w:p>
         </w:tc>
@@ -3967,7 +3967,7 @@
           </w:tcPr>
           <w:p>
             <w:r>
-              <w:t>7.90</w:t>
+              <w:t>7.93</w:t>
             </w:r>
           </w:p>
         </w:tc>
@@ -3979,7 +3979,7 @@
           </w:tcPr>
           <w:p>
             <w:r>
-              <w:t>UNN Nsukka 132kV</w:t>
+              <w:t>Oji River 132kV</w:t>
             </w:r>
           </w:p>
         </w:tc>
@@ -3989,7 +3989,7 @@
           </w:tcPr>
           <w:p>
             <w:r>
-              <w:t>UNN</w:t>
+              <w:t>ORUMBA</w:t>
             </w:r>
           </w:p>
         </w:tc>
@@ -3999,7 +3999,7 @@
           </w:tcPr>
           <w:p>
             <w:r>
-              <w:t>A</w:t>
+              <w:t>C</w:t>
             </w:r>
           </w:p>
         </w:tc>
@@ -4009,7 +4009,7 @@
           </w:tcPr>
           <w:p>
             <w:r>
-              <w:t>0.47</w:t>
+              <w:t>0.60</w:t>
             </w:r>
           </w:p>
         </w:tc>
@@ -4019,7 +4019,7 @@
           </w:tcPr>
           <w:p>
             <w:r>
-              <w:t>8.40</w:t>
+              <w:t>25.20</w:t>
             </w:r>
           </w:p>
         </w:tc>
@@ -4029,7 +4029,7 @@
           </w:tcPr>
           <w:p>
             <w:r>
-              <w:t>7.93</w:t>
+              <w:t>24.60</w:t>
             </w:r>
           </w:p>
         </w:tc>
@@ -4041,7 +4041,7 @@
           </w:tcPr>
           <w:p>
             <w:r>
-              <w:t>UNN Nsukka 132kV</w:t>
+              <w:t>Oji River 132kV</w:t>
             </w:r>
           </w:p>
         </w:tc>
@@ -4051,7 +4051,7 @@
           </w:tcPr>
           <w:p>
             <w:r>
-              <w:t>ORBA</w:t>
+              <w:t>ACHI</w:t>
             </w:r>
           </w:p>
         </w:tc>
@@ -4061,7 +4061,7 @@
           </w:tcPr>
           <w:p>
             <w:r>
-              <w:t>A (assumed)</w:t>
+              <w:t>C</w:t>
             </w:r>
           </w:p>
         </w:tc>
@@ -4071,7 +4071,7 @@
           </w:tcPr>
           <w:p>
             <w:r>
-              <w:t>0.25</w:t>
+              <w:t>0.50</w:t>
             </w:r>
           </w:p>
         </w:tc>
@@ -4081,7 +4081,7 @@
           </w:tcPr>
           <w:p>
             <w:r>
-              <w:t>8.40</w:t>
+              <w:t>25.20</w:t>
             </w:r>
           </w:p>
         </w:tc>
@@ -4091,7 +4091,7 @@
           </w:tcPr>
           <w:p>
             <w:r>
-              <w:t>8.15</w:t>
+              <w:t>24.70</w:t>
             </w:r>
           </w:p>
         </w:tc>
@@ -4103,7 +4103,7 @@
           </w:tcPr>
           <w:p>
             <w:r>
-              <w:t>Oji River 132kV</w:t>
+              <w:t>UNN Nsukka 132kV</w:t>
             </w:r>
           </w:p>
         </w:tc>
@@ -4113,7 +4113,7 @@
           </w:tcPr>
           <w:p>
             <w:r>
-              <w:t>ACHI</w:t>
+              <w:t>ORBA</w:t>
             </w:r>
           </w:p>
         </w:tc>
@@ -4133,7 +4133,7 @@
           </w:tcPr>
           <w:p>
             <w:r>
-              <w:t>0.50</w:t>
+              <w:t>0.25</w:t>
             </w:r>
           </w:p>
         </w:tc>
@@ -4153,7 +4153,7 @@
           </w:tcPr>
           <w:p>
             <w:r>
-              <w:t>24.70</w:t>
+              <w:t>24.95</w:t>
             </w:r>
           </w:p>
         </w:tc>
@@ -4170,7 +4170,7 @@
     </w:p>
     <w:p>
       <w:r>
-        <w:t>Excess hours are the TCN outage hours recorded for a feeder above its band allowance (or the 4h/day default where no band is recorded), and the excess load loss and cost are calculated from the load lost during those excess hours. These figures apply only to Week 3 (2026-09-13 to 2026-09-19) and must not be added to other weekly figures to estimate the month; only month-to-date totals should be used for that purpose.</w:t>
+        <w:t>Excess hours are calculated as the TCN outage hours recorded for each feeder minus its allowable hours under its band (or the 4h/day default where no band is recorded); excess load loss and estimated cost are then derived from that excess hours figure. These figures apply strictly to Week 3 (13 to 19 September 2026) and must not be added to other weekly reports to estimate month-to-date totals; only the month-to-date figures should be used for that purpose.</w:t>
       </w:r>
     </w:p>
     <w:tbl>
@@ -4228,7 +4228,7 @@
                 <w:b/>
                 <w:sz w:val="28"/>
               </w:rPr>
-              <w:t>233.18 hrs</w:t>
+              <w:t>230.77 hrs</w:t>
             </w:r>
           </w:p>
         </w:tc>
@@ -4251,7 +4251,7 @@
                 <w:b/>
                 <w:sz w:val="28"/>
               </w:rPr>
-              <w:t>1,259.82 MWh</w:t>
+              <w:t>1,230.89 MWh</w:t>
             </w:r>
           </w:p>
         </w:tc>
@@ -4274,7 +4274,7 @@
                 <w:b/>
                 <w:sz w:val="28"/>
               </w:rPr>
-              <w:t>₦217,430,514.00</w:t>
+              <w:t>₦191,966,750.00</w:t>
             </w:r>
           </w:p>
         </w:tc>
@@ -4446,7 +4446,7 @@
           </w:tcPr>
           <w:p>
             <w:r>
-              <w:t>A (assumed)</w:t>
+              <w:t>A</w:t>
             </w:r>
           </w:p>
         </w:tc>
@@ -4682,7 +4682,7 @@
           </w:tcPr>
           <w:p>
             <w:r>
-              <w:t>OBOSI</w:t>
+              <w:t>ARMY BARRACKS</w:t>
             </w:r>
           </w:p>
         </w:tc>
@@ -4692,7 +4692,7 @@
           </w:tcPr>
           <w:p>
             <w:r>
-              <w:t>A (assumed)</w:t>
+              <w:t>A</w:t>
             </w:r>
           </w:p>
         </w:tc>
@@ -4702,7 +4702,7 @@
           </w:tcPr>
           <w:p>
             <w:r>
-              <w:t>33.70</w:t>
+              <w:t>46.70</w:t>
             </w:r>
           </w:p>
         </w:tc>
@@ -4722,7 +4722,7 @@
           </w:tcPr>
           <w:p>
             <w:r>
-              <w:t>25.30</w:t>
+              <w:t>38.30</w:t>
             </w:r>
           </w:p>
         </w:tc>
@@ -4732,7 +4732,7 @@
           </w:tcPr>
           <w:p>
             <w:r>
-              <w:t>164.52</w:t>
+              <w:t>161.92</w:t>
             </w:r>
           </w:p>
         </w:tc>
@@ -4742,7 +4742,7 @@
           </w:tcPr>
           <w:p>
             <w:r>
-              <w:t>₦34,466,940.00</w:t>
+              <w:t>₦33,922,240.00</w:t>
             </w:r>
           </w:p>
         </w:tc>
@@ -4764,7 +4764,7 @@
           </w:tcPr>
           <w:p>
             <w:r>
-              <w:t>ARMY BARRACKS</w:t>
+              <w:t>UMUNYA</w:t>
             </w:r>
           </w:p>
         </w:tc>
@@ -4774,7 +4774,7 @@
           </w:tcPr>
           <w:p>
             <w:r>
-              <w:t>A</w:t>
+              <w:t>B</w:t>
             </w:r>
           </w:p>
         </w:tc>
@@ -4784,7 +4784,7 @@
           </w:tcPr>
           <w:p>
             <w:r>
-              <w:t>46.70</w:t>
+              <w:t>42.87</w:t>
             </w:r>
           </w:p>
         </w:tc>
@@ -4794,7 +4794,7 @@
           </w:tcPr>
           <w:p>
             <w:r>
-              <w:t>8.40</w:t>
+              <w:t>16.80</w:t>
             </w:r>
           </w:p>
         </w:tc>
@@ -4804,7 +4804,7 @@
           </w:tcPr>
           <w:p>
             <w:r>
-              <w:t>38.30</w:t>
+              <w:t>26.07</w:t>
             </w:r>
           </w:p>
         </w:tc>
@@ -4814,7 +4814,7 @@
           </w:tcPr>
           <w:p>
             <w:r>
-              <w:t>161.92</w:t>
+              <w:t>132.56</w:t>
             </w:r>
           </w:p>
         </w:tc>
@@ -4824,7 +4824,7 @@
           </w:tcPr>
           <w:p>
             <w:r>
-              <w:t>₦33,922,240.00</w:t>
+              <w:t>₦8,801,984.00</w:t>
             </w:r>
           </w:p>
         </w:tc>
@@ -5010,7 +5010,7 @@
           </w:tcPr>
           <w:p>
             <w:r>
-              <w:t>UMUNYA</w:t>
+              <w:t>OBOSI</w:t>
             </w:r>
           </w:p>
         </w:tc>
@@ -5030,7 +5030,7 @@
           </w:tcPr>
           <w:p>
             <w:r>
-              <w:t>36.88</w:t>
+              <w:t>33.70</w:t>
             </w:r>
           </w:p>
         </w:tc>
@@ -5050,7 +5050,7 @@
           </w:tcPr>
           <w:p>
             <w:r>
-              <w:t>20.08</w:t>
+              <w:t>16.90</w:t>
             </w:r>
           </w:p>
         </w:tc>
@@ -5060,7 +5060,7 @@
           </w:tcPr>
           <w:p>
             <w:r>
-              <w:t>99.05</w:t>
+              <w:t>102.08</w:t>
             </w:r>
           </w:p>
         </w:tc>
@@ -5070,7 +5070,7 @@
           </w:tcPr>
           <w:p>
             <w:r>
-              <w:t>₦6,576,920.00</w:t>
+              <w:t>₦6,778,112.00</w:t>
             </w:r>
           </w:p>
         </w:tc>
@@ -5095,7 +5095,7 @@
         <w:pStyle w:val="ListParagraph"/>
       </w:pPr>
       <w:r>
-        <w:t>Onitsha 132kV OSSAMALA (Band A, assumed) recorded 53.08 excess hours at a cost of NGN 51,319,120, the highest in the region. Six of its seven events are logged as "TRF LIM" against 3NSHTR5 (Mob-1) 45MVA 132/33/11kV, described repeatedly as "TRF load limitation," with a single planned event on 2026-09-15 tied to TCN LMD crew work separating the 3NSHTR5 and 3NSHTR3 (TR13) 60MVA bus sections.</w:t>
+        <w:t>OSSAMALA feeder at Onitsha 132kV recorded 53.08 excess hours and an estimated cost of NGN 51,319,120, the highest in the region. Six of its seven logged events were tied to "TRF LIM" on the 3NSHTR5 (Mob-1) 45MVA 132/33/11kV transformer, with remarks stating the feeder was repeatedly opened due to transformer load limitation; one planned event on 15 September also cited work to separate the 3NSHTR5 and 3NSHTR3 (TR13) 60MVA bus sections. This is a single recurring cause across multiple long outages, including one of 16.33 hours and one of 14.23 hours.</w:t>
       </w:r>
     </w:p>
     <w:p>
@@ -5103,7 +5103,7 @@
         <w:pStyle w:val="ListParagraph"/>
       </w:pPr>
       <w:r>
-        <w:t>Onitsha 132kV CANTONMENT (Band A, assumed) cost NGN 39,166,025 on 35.4 excess hours. Most events again cite 3NSHTR5 (Mob-1) load limitation, but the 2026-09-18 event was a Forced outage on 3NSHTR3 (TR13) 60MVA, tripping on Tap Changer Buchholz; remarks confirm TCN maintenance crews cleaned and dried the OLTC Buchholz relay and sealed minor leakages, indicating an aging or leaking OLTC unit on TR13.</w:t>
+        <w:t>CANTONMENT feeder (band assumed as Band A) recorded 35.4 excess hours and NGN 39,166,025 in estimated cost. Four events were due to 3NSHTR5 (Mob-1) load limitation; one Forced-class event on 18 September (5.25 hours) was caused by the 3NSHTR3 (TR13) 60MVA transformer Primary CB tripping on "Tap Changer Bucholz," with remarks noting TCN maintenance crew found water content in the OLTC Buchholz relay and sealed minor leakages. The final event on 19 September again cited 3NSHTR3 (TR13) load limitation, showing the fault has shifted between the two transformers.</w:t>
       </w:r>
     </w:p>
     <w:p>
@@ -5111,7 +5111,7 @@
         <w:pStyle w:val="ListParagraph"/>
       </w:pPr>
       <w:r>
-        <w:t>Onitsha 132kV AWADA II (Band A, not assumed) cost NGN 36,978,845 on 34.48 excess hours, driven by the same 3NSHTR5 load limitation pattern and the same 2026-09-18 TR13 Buchholz trip recorded at CANTONMENT, confirming that the TR13 Buchholz fault affected multiple feeders simultaneously.</w:t>
+        <w:t>AWADA II and ARMY BARRACKS feeders, both also fed from the same Onitsha 132kV transformers, recorded 34.48 and 38.3 excess hours respectively, costing NGN 36,978,845 and NGN 33,922,240. Both show the identical pattern: repeated 3NSHTR5 (Mob-1) load-limitation openings, the same 15 September planned bus-separation event, and the same 18 September Forced outage from the 3NSHTR3 (TR13) Buchholz relay trip described above (water content found, leaks sealed). This confirms the same equipment is behind the bulk of excess cost on four separate feeders fed from this station.</w:t>
       </w:r>
     </w:p>
     <w:p>
@@ -5119,23 +5119,7 @@
         <w:pStyle w:val="ListParagraph"/>
       </w:pPr>
       <w:r>
-        <w:t>Onitsha 132kV OBOSI (Band A, assumed) cost NGN 34,466,940 on 25.3 excess hours, again dominated by 3NSHTR5 (Mob-1) load limitation events across six of seven outages, plus the same planned bus-separation event on 2026-09-15.</w:t>
-      </w:r>
-    </w:p>
-    <w:p>
-      <w:pPr>
-        <w:pStyle w:val="ListParagraph"/>
-      </w:pPr>
-      <w:r>
-        <w:t>Onitsha 132kV ARMY BARRACKS (Band A, not assumed) cost NGN 33,922,240 on 38.3 excess hours, with the same 3NSHTR5 load limitation pattern and the same TR13 Buchholz trip on 2026-09-18 recorded at the other Onitsha feeders, reinforcing that a single transformer fault at Onitsha station is the shared root cause across five of the six highest-cost feeders.</w:t>
-      </w:r>
-    </w:p>
-    <w:p>
-      <w:pPr>
-        <w:pStyle w:val="ListParagraph"/>
-      </w:pPr>
-      <w:r>
-        <w:t>Onitsha 132kV NNEWI INDUSTRIAL (Band B) cost NGN 8,186,456 on 14.32 excess hours, all four events again attributed to 3NSHTR5 (Mob-1) load limitation, with no other cause recorded.</w:t>
+        <w:t>UMUNYA, NNEWI INDUSTRIAL, NNEWI and OBOSI feeders, all at Onitsha 132kV and lower cost impact (NGN 8,801,984 down to NGN 6,778,112), also report outages consistently tied to 3NSHTR5 (Mob-1) load limitation, with OBOSI additionally carrying the 15 September planned bus-separation event. No alternative cause is recorded for any of these feeders; the single shared root cause across all eight top-cost feeders is loading constraint and intermittent fault condition on the Onitsha 132kV 3NSHTR5 (Mob-1) and 3NSHTR3 (TR13) transformers.</w:t>
       </w:r>
     </w:p>
     <w:p>
@@ -5156,7 +5140,7 @@
         <w:pStyle w:val="Heading2"/>
       </w:pPr>
       <w:r>
-        <w:t>Feeders priced as Band A (assumed) -- 18</w:t>
+        <w:t>Feeders priced as Band A (assumed) -- 3</w:t>
       </w:r>
     </w:p>
     <w:tbl>
@@ -5218,7 +5202,7 @@
           </w:tcPr>
           <w:p>
             <w:r>
-              <w:t>OSSAMALA</w:t>
+              <w:t>CANTONMENT</w:t>
             </w:r>
           </w:p>
         </w:tc>
@@ -5230,7 +5214,7 @@
           </w:tcPr>
           <w:p>
             <w:r>
-              <w:t>Onitsha 132kV</w:t>
+              <w:t>Agu Awka 132kV</w:t>
             </w:r>
           </w:p>
         </w:tc>
@@ -5240,7 +5224,7 @@
           </w:tcPr>
           <w:p>
             <w:r>
-              <w:t>CANTONMENT</w:t>
+              <w:t>ROTIC</w:t>
             </w:r>
           </w:p>
         </w:tc>
@@ -5252,7 +5236,7 @@
           </w:tcPr>
           <w:p>
             <w:r>
-              <w:t>Onitsha 132kV</w:t>
+              <w:t>Agu Awka 132kV</w:t>
             </w:r>
           </w:p>
         </w:tc>
@@ -5262,337 +5246,7 @@
           </w:tcPr>
           <w:p>
             <w:r>
-              <w:t>OBOSI</w:t>
-            </w:r>
-          </w:p>
-        </w:tc>
-      </w:tr>
-      <w:tr>
-        <w:tc>
-          <w:tcPr>
-            <w:tcW w:type="dxa" w:w="4320"/>
-          </w:tcPr>
-          <w:p>
-            <w:r>
-              <w:t>Onitsha 132kV</w:t>
-            </w:r>
-          </w:p>
-        </w:tc>
-        <w:tc>
-          <w:tcPr>
-            <w:tcW w:type="dxa" w:w="4320"/>
-          </w:tcPr>
-          <w:p>
-            <w:r>
-              <w:t>JUDDY BOLEMA</w:t>
-            </w:r>
-          </w:p>
-        </w:tc>
-      </w:tr>
-      <w:tr>
-        <w:tc>
-          <w:tcPr>
-            <w:tcW w:type="dxa" w:w="4320"/>
-          </w:tcPr>
-          <w:p>
-            <w:r>
-              <w:t>Abakaliki 132kV</w:t>
-            </w:r>
-          </w:p>
-        </w:tc>
-        <w:tc>
-          <w:tcPr>
-            <w:tcW w:type="dxa" w:w="4320"/>
-          </w:tcPr>
-          <w:p>
-            <w:r>
-              <w:t>AFIKPO</w:t>
-            </w:r>
-          </w:p>
-        </w:tc>
-      </w:tr>
-      <w:tr>
-        <w:tc>
-          <w:tcPr>
-            <w:tcW w:type="dxa" w:w="4320"/>
-          </w:tcPr>
-          <w:p>
-            <w:r>
-              <w:t>GCM 132kV</w:t>
-            </w:r>
-          </w:p>
-        </w:tc>
-        <w:tc>
-          <w:tcPr>
-            <w:tcW w:type="dxa" w:w="4320"/>
-          </w:tcPr>
-          <w:p>
-            <w:r>
-              <w:t>HARBOUR</w:t>
-            </w:r>
-          </w:p>
-        </w:tc>
-      </w:tr>
-      <w:tr>
-        <w:tc>
-          <w:tcPr>
-            <w:tcW w:type="dxa" w:w="4320"/>
-          </w:tcPr>
-          <w:p>
-            <w:r>
-              <w:t>GCM 132kV</w:t>
-            </w:r>
-          </w:p>
-        </w:tc>
-        <w:tc>
-          <w:tcPr>
-            <w:tcW w:type="dxa" w:w="4320"/>
-          </w:tcPr>
-          <w:p>
-            <w:r>
-              <w:t>E- AMOBI</w:t>
-            </w:r>
-          </w:p>
-        </w:tc>
-      </w:tr>
-      <w:tr>
-        <w:tc>
-          <w:tcPr>
-            <w:tcW w:type="dxa" w:w="4320"/>
-          </w:tcPr>
-          <w:p>
-            <w:r>
-              <w:t>GCM 132kV</w:t>
-            </w:r>
-          </w:p>
-        </w:tc>
-        <w:tc>
-          <w:tcPr>
-            <w:tcW w:type="dxa" w:w="4320"/>
-          </w:tcPr>
-          <w:p>
-            <w:r>
-              <w:t>GOLDEN OIL</w:t>
-            </w:r>
-          </w:p>
-        </w:tc>
-      </w:tr>
-      <w:tr>
-        <w:tc>
-          <w:tcPr>
-            <w:tcW w:type="dxa" w:w="4320"/>
-          </w:tcPr>
-          <w:p>
-            <w:r>
-              <w:t>Agu Awka 132kV</w:t>
-            </w:r>
-          </w:p>
-        </w:tc>
-        <w:tc>
-          <w:tcPr>
-            <w:tcW w:type="dxa" w:w="4320"/>
-          </w:tcPr>
-          <w:p>
-            <w:r>
-              <w:t>AIRPORT</w:t>
-            </w:r>
-          </w:p>
-        </w:tc>
-      </w:tr>
-      <w:tr>
-        <w:tc>
-          <w:tcPr>
-            <w:tcW w:type="dxa" w:w="4320"/>
-          </w:tcPr>
-          <w:p>
-            <w:r>
-              <w:t>Oji River 132kV</w:t>
-            </w:r>
-          </w:p>
-        </w:tc>
-        <w:tc>
-          <w:tcPr>
-            <w:tcW w:type="dxa" w:w="4320"/>
-          </w:tcPr>
-          <w:p>
-            <w:r>
-              <w:t>WATER WORKS</w:t>
-            </w:r>
-          </w:p>
-        </w:tc>
-      </w:tr>
-      <w:tr>
-        <w:tc>
-          <w:tcPr>
-            <w:tcW w:type="dxa" w:w="4320"/>
-          </w:tcPr>
-          <w:p>
-            <w:r>
-              <w:t>Oji River 132kV</w:t>
-            </w:r>
-          </w:p>
-        </w:tc>
-        <w:tc>
-          <w:tcPr>
-            <w:tcW w:type="dxa" w:w="4320"/>
-          </w:tcPr>
-          <w:p>
-            <w:r>
-              <w:t>ORUMBA</w:t>
-            </w:r>
-          </w:p>
-        </w:tc>
-      </w:tr>
-      <w:tr>
-        <w:tc>
-          <w:tcPr>
-            <w:tcW w:type="dxa" w:w="4320"/>
-          </w:tcPr>
-          <w:p>
-            <w:r>
-              <w:t>Oji River 132kV</w:t>
-            </w:r>
-          </w:p>
-        </w:tc>
-        <w:tc>
-          <w:tcPr>
-            <w:tcW w:type="dxa" w:w="4320"/>
-          </w:tcPr>
-          <w:p>
-            <w:r>
-              <w:t>OJI LOCAL</w:t>
-            </w:r>
-          </w:p>
-        </w:tc>
-      </w:tr>
-      <w:tr>
-        <w:tc>
-          <w:tcPr>
-            <w:tcW w:type="dxa" w:w="4320"/>
-          </w:tcPr>
-          <w:p>
-            <w:r>
-              <w:t>Agu Awka 132kV</w:t>
-            </w:r>
-          </w:p>
-        </w:tc>
-        <w:tc>
-          <w:tcPr>
-            <w:tcW w:type="dxa" w:w="4320"/>
-          </w:tcPr>
-          <w:p>
-            <w:r>
-              <w:t>ROTIC</w:t>
-            </w:r>
-          </w:p>
-        </w:tc>
-      </w:tr>
-      <w:tr>
-        <w:tc>
-          <w:tcPr>
-            <w:tcW w:type="dxa" w:w="4320"/>
-          </w:tcPr>
-          <w:p>
-            <w:r>
-              <w:t>Oji River 132kV</w:t>
-            </w:r>
-          </w:p>
-        </w:tc>
-        <w:tc>
-          <w:tcPr>
-            <w:tcW w:type="dxa" w:w="4320"/>
-          </w:tcPr>
-          <w:p>
-            <w:r>
-              <w:t>COCA COLA</w:t>
-            </w:r>
-          </w:p>
-        </w:tc>
-      </w:tr>
-      <w:tr>
-        <w:tc>
-          <w:tcPr>
-            <w:tcW w:type="dxa" w:w="4320"/>
-          </w:tcPr>
-          <w:p>
-            <w:r>
-              <w:t>Agu Awka 132kV</w:t>
-            </w:r>
-          </w:p>
-        </w:tc>
-        <w:tc>
-          <w:tcPr>
-            <w:tcW w:type="dxa" w:w="4320"/>
-          </w:tcPr>
-          <w:p>
-            <w:r>
               <w:t>OGBOJI</w:t>
-            </w:r>
-          </w:p>
-        </w:tc>
-      </w:tr>
-      <w:tr>
-        <w:tc>
-          <w:tcPr>
-            <w:tcW w:type="dxa" w:w="4320"/>
-          </w:tcPr>
-          <w:p>
-            <w:r>
-              <w:t>New-Haven 132kV</w:t>
-            </w:r>
-          </w:p>
-        </w:tc>
-        <w:tc>
-          <w:tcPr>
-            <w:tcW w:type="dxa" w:w="4320"/>
-          </w:tcPr>
-          <w:p>
-            <w:r>
-              <w:t>GOVT. HOUSE</w:t>
-            </w:r>
-          </w:p>
-        </w:tc>
-      </w:tr>
-      <w:tr>
-        <w:tc>
-          <w:tcPr>
-            <w:tcW w:type="dxa" w:w="4320"/>
-          </w:tcPr>
-          <w:p>
-            <w:r>
-              <w:t>New-Haven 132kV</w:t>
-            </w:r>
-          </w:p>
-        </w:tc>
-        <w:tc>
-          <w:tcPr>
-            <w:tcW w:type="dxa" w:w="4320"/>
-          </w:tcPr>
-          <w:p>
-            <w:r>
-              <w:t>IND. LAYOUT</w:t>
-            </w:r>
-          </w:p>
-        </w:tc>
-      </w:tr>
-      <w:tr>
-        <w:tc>
-          <w:tcPr>
-            <w:tcW w:type="dxa" w:w="4320"/>
-          </w:tcPr>
-          <w:p>
-            <w:r>
-              <w:t>UNN Nsukka 132kV</w:t>
-            </w:r>
-          </w:p>
-        </w:tc>
-        <w:tc>
-          <w:tcPr>
-            <w:tcW w:type="dxa" w:w="4320"/>
-          </w:tcPr>
-          <w:p>
-            <w:r>
-              <w:t>ORBA</w:t>
             </w:r>
           </w:p>
         </w:tc>

</xml_diff>